<commit_message>
feat: CV template in Calibri with list bullets, hidden empty sections and a photo slot
Co-Authored-By: Claude Opus 5.5 <noreply@anthropic.com>
</commit_message>
<xml_diff>
--- a/plugins/job-radar/templates/Lebenslauf_template.docx
+++ b/plugins/job-radar/templates/Lebenslauf_template.docx
@@ -77,6 +77,9 @@
                 <w:rFonts w:asciiTheme="minorHAnsi" w:hAnsiTheme="minorHAnsi"/>
               </w:rPr>
             </w:pPr>
+            <w:r>
+              <w:t>{% if foto %}{{ foto }}{% endif %}</w:t>
+            </w:r>
           </w:p>
         </w:tc>
       </w:tr>
@@ -104,9 +107,8 @@
       </w:r>
     </w:p>
     <w:p>
-      <w:pPr/>
-      <w:r>
-        <w:t>{% for pos in positions %}</w:t>
+      <w:r>
+        <w:t>{%p for pos in positions %}</w:t>
       </w:r>
     </w:p>
     <w:p>
@@ -142,53 +144,37 @@
       </w:r>
     </w:p>
     <w:p>
-      <w:pPr/>
-      <w:r>
-        <w:t>{% for bullet in pos.bullets %}</w:t>
-      </w:r>
-    </w:p>
-    <w:p>
-      <w:pPr>
-        <w:spacing w:before="120" w:after="40"/>
-        <w:ind w:left="250"/>
-        <w:rPr>
-          <w:rFonts w:asciiTheme="minorHAnsi" w:hAnsiTheme="minorHAnsi"/>
-        </w:rPr>
-      </w:pPr>
-      <w:r>
-        <w:rPr>
-          <w:rFonts w:asciiTheme="minorHAnsi" w:hAnsiTheme="minorHAnsi"/>
-          <w:b/>
-          <w:bCs/>
-          <w:i/>
-          <w:iCs/>
-          <w:color w:val="2980B9"/>
+      <w:r>
+        <w:t>{%p for bullet in pos.bullets %}</w:t>
+      </w:r>
+    </w:p>
+    <w:p>
+      <w:pPr>
+        <w:pStyle w:val="ListParagraph"/>
+        <w:numPr>
+          <w:ilvl w:val="0"/>
+          <w:numId w:val="2"/>
+        </w:numPr>
+        <w:spacing w:before="20" w:after="20"/>
+        <w:rPr>
+          <w:rFonts w:asciiTheme="minorHAnsi" w:hAnsiTheme="minorHAnsi"/>
+        </w:rPr>
+      </w:pPr>
+      <w:r>
+        <w:rPr>
+          <w:rFonts w:asciiTheme="minorHAnsi" w:hAnsiTheme="minorHAnsi"/>
         </w:rPr>
         <w:t>{{ bullet }}</w:t>
       </w:r>
     </w:p>
     <w:p>
-      <w:pPr>
-        <w:spacing w:before="120" w:after="40"/>
-        <w:ind w:left="250"/>
-        <w:rPr>
-          <w:rFonts w:asciiTheme="minorHAnsi" w:hAnsiTheme="minorHAnsi"/>
-        </w:rPr>
-      </w:pPr>
-      <w:r>
-        <w:t>{% endfor %}</w:t>
-      </w:r>
-    </w:p>
-    <w:p>
-      <w:pPr>
-        <w:spacing w:before="120" w:after="40"/>
-        <w:ind w:left="250"/>
-        <w:rPr>
-          <w:rFonts w:asciiTheme="minorHAnsi" w:hAnsiTheme="minorHAnsi"/>
-        </w:rPr>
-      </w:pPr>
-      <w:r>
-        <w:t>{% endfor %}</w:t>
+      <w:r>
+        <w:t>{%p endfor %}</w:t>
+      </w:r>
+    </w:p>
+    <w:p>
+      <w:r>
+        <w:t>{%p endfor %}</w:t>
       </w:r>
     </w:p>
     <w:p>
@@ -306,6 +292,11 @@
       </w:r>
     </w:p>
     <w:p>
+      <w:r>
+        <w:t>{%p if international %}</w:t>
+      </w:r>
+    </w:p>
+    <w:p>
       <w:pPr>
         <w:pBdr>
           <w:bottom w:val="single" w:sz="2" w:space="0" w:color="2980B9"/>
@@ -325,6 +316,11 @@
           <w:szCs w:val="24"/>
         </w:rPr>
         <w:t>INTERNATIONALER HINTERGRUND</w:t>
+      </w:r>
+    </w:p>
+    <w:p>
+      <w:r>
+        <w:t>{%p for item in international %}</w:t>
       </w:r>
     </w:p>
     <w:p>
@@ -343,7 +339,22 @@
         <w:rPr>
           <w:rFonts w:asciiTheme="minorHAnsi" w:hAnsiTheme="minorHAnsi"/>
         </w:rPr>
-        <w:t>{{ international_section }}</w:t>
+        <w:t>{{ item }}</w:t>
+      </w:r>
+    </w:p>
+    <w:p>
+      <w:r>
+        <w:t>{%p endfor %}</w:t>
+      </w:r>
+    </w:p>
+    <w:p>
+      <w:r>
+        <w:t>{%p endif %}</w:t>
+      </w:r>
+    </w:p>
+    <w:p>
+      <w:r>
+        <w:t>{%p if weiteres %}</w:t>
       </w:r>
     </w:p>
     <w:p>
@@ -366,6 +377,11 @@
           <w:szCs w:val="24"/>
         </w:rPr>
         <w:t>WEITERES</w:t>
+      </w:r>
+    </w:p>
+    <w:p>
+      <w:r>
+        <w:t>{%p for item in weiteres %}</w:t>
       </w:r>
     </w:p>
     <w:p>
@@ -384,7 +400,17 @@
         <w:rPr>
           <w:rFonts w:asciiTheme="minorHAnsi" w:hAnsiTheme="minorHAnsi"/>
         </w:rPr>
-        <w:t>{{ weiteres_section }}</w:t>
+        <w:t>{{ item }}</w:t>
+      </w:r>
+    </w:p>
+    <w:p>
+      <w:r>
+        <w:t>{%p endfor %}</w:t>
+      </w:r>
+    </w:p>
+    <w:p>
+      <w:r>
+        <w:t>{%p endif %}</w:t>
       </w:r>
     </w:p>
     <w:sectPr>
@@ -559,7 +585,7 @@
   <w:docDefaults>
     <w:rPrDefault>
       <w:rPr>
-        <w:rFonts w:ascii="Arial" w:eastAsia="Arial" w:hAnsi="Arial" w:cs="Arial"/>
+        <w:rFonts w:ascii="Calibri" w:eastAsia="Arial" w:hAnsi="Calibri" w:cs="Arial"/>
         <w:sz w:val="21"/>
         <w:szCs w:val="21"/>
         <w:lang w:val="en-DE" w:eastAsia="en-DE" w:bidi="ar-SA"/>
@@ -1167,7 +1193,7 @@
     </a:clrScheme>
     <a:fontScheme name="Office">
       <a:majorFont>
-        <a:latin typeface="Aptos Display" panose="02110004020202020204"/>
+        <a:latin typeface="Calibri" panose="02110004020202020204"/>
         <a:ea typeface=""/>
         <a:cs typeface=""/>
         <a:font script="Jpan" typeface="游ゴシック Light"/>
@@ -1219,7 +1245,7 @@
         <a:font script="Tfng" typeface="Ebrima"/>
       </a:majorFont>
       <a:minorFont>
-        <a:latin typeface="Aptos" panose="02110004020202020204"/>
+        <a:latin typeface="Calibri" panose="02110004020202020204"/>
         <a:ea typeface=""/>
         <a:cs typeface=""/>
         <a:font script="Jpan" typeface="游明朝"/>

</xml_diff>

<commit_message>
fix: review follow-ups for the CV renderer and template
- load_data turns empty, missing or single-string list fields into lists
- birthdate line is a {%p if %} block, no gap under the contact line
- theme panose of Calibri, template revision, dates and editing time reset
- rendered CV and letter are dated at render time
- tighter tests for loop blanks, section headings and letter comments

Co-Authored-By: Claude Opus 5.5 <noreply@anthropic.com>
</commit_message>
<xml_diff>
--- a/plugins/job-radar/templates/Lebenslauf_template.docx
+++ b/plugins/job-radar/templates/Lebenslauf_template.docx
@@ -58,11 +58,21 @@
           </w:p>
           <w:p>
             <w:r>
+              <w:t>{%p if geburtsdatum %}</w:t>
+            </w:r>
+          </w:p>
+          <w:p>
+            <w:r>
               <w:rPr>
                 <w:color w:val="7F8C8D"/>
                 <w:sz w:val="19"/>
               </w:rPr>
-              <w:t>{% if geburtsdatum %}Geboren am {{ geburtsdatum }}{% endif %}</w:t>
+              <w:t>Geboren am {{ geburtsdatum }}</w:t>
+            </w:r>
+          </w:p>
+          <w:p>
+            <w:r>
+              <w:t>{%p endif %}</w:t>
             </w:r>
           </w:p>
         </w:tc>
@@ -1193,7 +1203,7 @@
     </a:clrScheme>
     <a:fontScheme name="Office">
       <a:majorFont>
-        <a:latin typeface="Calibri" panose="02110004020202020204"/>
+        <a:latin typeface="Calibri" panose="020F0502020204030204"/>
         <a:ea typeface=""/>
         <a:cs typeface=""/>
         <a:font script="Jpan" typeface="游ゴシック Light"/>
@@ -1245,7 +1255,7 @@
         <a:font script="Tfng" typeface="Ebrima"/>
       </a:majorFont>
       <a:minorFont>
-        <a:latin typeface="Calibri" panose="02110004020202020204"/>
+        <a:latin typeface="Calibri" panose="020F0502020204030204"/>
         <a:ea typeface=""/>
         <a:cs typeface=""/>
         <a:font script="Jpan" typeface="游明朝"/>

</xml_diff>

<commit_message>
fix: photo check catches every unreadable image, headings stay with their text
The photo pre-check now catches any exception from python-docx (a truncated
JPEG raises a bare Exception, a JPEG without SOF a KeyError) and treats an
image with width or height 0 as unreadable instead of dividing by zero later.

Template: section headings and the two position title lines carry keepNext,
the education paragraph carries keepLines, so no heading, position title or
education entry ends a page alone. The one-page test shows stderr on failure.

Co-Authored-By: Claude Opus 5.5 <noreply@anthropic.com>
</commit_message>
<xml_diff>
--- a/plugins/job-radar/templates/Lebenslauf_template.docx
+++ b/plugins/job-radar/templates/Lebenslauf_template.docx
@@ -96,6 +96,7 @@
     </w:tbl>
     <w:p>
       <w:pPr>
+        <w:keepNext/>
         <w:pBdr>
           <w:bottom w:val="single" w:sz="2" w:space="0" w:color="2980B9"/>
         </w:pBdr>
@@ -123,6 +124,7 @@
     </w:p>
     <w:p>
       <w:pPr>
+        <w:keepNext/>
         <w:spacing w:before="200" w:after="40"/>
         <w:rPr>
           <w:rFonts w:asciiTheme="minorHAnsi" w:hAnsiTheme="minorHAnsi"/>
@@ -138,6 +140,7 @@
     </w:p>
     <w:p>
       <w:pPr>
+        <w:keepNext/>
         <w:spacing w:after="60"/>
         <w:rPr>
           <w:rFonts w:asciiTheme="minorHAnsi" w:hAnsiTheme="minorHAnsi"/>
@@ -189,6 +192,7 @@
     </w:p>
     <w:p>
       <w:pPr>
+        <w:keepNext/>
         <w:pBdr>
           <w:bottom w:val="single" w:sz="2" w:space="0" w:color="2980B9"/>
         </w:pBdr>
@@ -211,6 +215,7 @@
     </w:p>
     <w:p>
       <w:pPr>
+        <w:keepLines/>
         <w:spacing w:before="120" w:after="40"/>
         <w:rPr>
           <w:rFonts w:asciiTheme="minorHAnsi" w:hAnsiTheme="minorHAnsi"/>
@@ -226,6 +231,7 @@
     </w:p>
     <w:p>
       <w:pPr>
+        <w:keepNext/>
         <w:pBdr>
           <w:bottom w:val="single" w:sz="2" w:space="0" w:color="2980B9"/>
         </w:pBdr>
@@ -264,6 +270,7 @@
     </w:p>
     <w:p>
       <w:pPr>
+        <w:keepNext/>
         <w:pBdr>
           <w:bottom w:val="single" w:sz="2" w:space="0" w:color="2980B9"/>
         </w:pBdr>
@@ -308,6 +315,7 @@
     </w:p>
     <w:p>
       <w:pPr>
+        <w:keepNext/>
         <w:pBdr>
           <w:bottom w:val="single" w:sz="2" w:space="0" w:color="2980B9"/>
         </w:pBdr>
@@ -369,6 +377,7 @@
     </w:p>
     <w:p>
       <w:pPr>
+        <w:keepNext/>
         <w:pBdr>
           <w:bottom w:val="single" w:sz="2" w:space="0" w:color="2980B9"/>
         </w:pBdr>

</xml_diff>